<commit_message>
Add hooks for docstring and requirements validation, update README and documentation
</commit_message>
<xml_diff>
--- a/.work/05.10.docx
+++ b/.work/05.10.docx
@@ -391,6 +391,324 @@
           <w:szCs w:val="24"/>
         </w:rPr>
         <w:t>’ és el mateix per totes les entrades, modificar artificialment aquesta entrada i/o aquesta sortida i donar la indicada. És a dir, si es dona d’inici un ascensor, donar l’altre ascensor, si es dona una de la Boqueria donar l’altre de la Boqueria i així.</w:t>
+      </w:r>
+      <w:r>
+        <w:rPr>
+          <w:rFonts w:ascii="Arial" w:hAnsi="Arial" w:cs="Arial"/>
+          <w:sz w:val="24"/>
+          <w:szCs w:val="24"/>
+        </w:rPr>
+        <w:t xml:space="preserve"> S’hauria de posar un missatge d’avís en aquest cas.</w:t>
+      </w:r>
+    </w:p>
+    <w:p>
+      <w:pPr>
+        <w:rPr>
+          <w:rFonts w:ascii="Arial" w:hAnsi="Arial" w:cs="Arial"/>
+          <w:sz w:val="24"/>
+          <w:szCs w:val="24"/>
+        </w:rPr>
+      </w:pPr>
+      <w:r>
+        <w:rPr>
+          <w:rFonts w:ascii="Arial" w:hAnsi="Arial" w:cs="Arial"/>
+          <w:sz w:val="24"/>
+          <w:szCs w:val="24"/>
+        </w:rPr>
+        <w:t>En el cas de la funció del pes amb diferents paràmetres:</w:t>
+      </w:r>
+    </w:p>
+    <w:p>
+      <w:pPr>
+        <w:pStyle w:val="Prrafodelista"/>
+        <w:numPr>
+          <w:ilvl w:val="0"/>
+          <w:numId w:val="1"/>
+        </w:numPr>
+        <w:rPr>
+          <w:rFonts w:ascii="Arial" w:hAnsi="Arial" w:cs="Arial"/>
+          <w:sz w:val="24"/>
+          <w:szCs w:val="24"/>
+        </w:rPr>
+      </w:pPr>
+      <w:r>
+        <w:rPr>
+          <w:rFonts w:ascii="Arial" w:hAnsi="Arial" w:cs="Arial"/>
+          <w:sz w:val="24"/>
+          <w:szCs w:val="24"/>
+        </w:rPr>
+        <w:t xml:space="preserve">In </w:t>
+      </w:r>
+      <w:proofErr w:type="spellStart"/>
+      <w:r>
+        <w:rPr>
+          <w:rFonts w:ascii="Arial" w:hAnsi="Arial" w:cs="Arial"/>
+          <w:sz w:val="24"/>
+          <w:szCs w:val="24"/>
+        </w:rPr>
+        <w:t>the</w:t>
+      </w:r>
+      <w:proofErr w:type="spellEnd"/>
+      <w:r>
+        <w:rPr>
+          <w:rFonts w:ascii="Arial" w:hAnsi="Arial" w:cs="Arial"/>
+          <w:sz w:val="24"/>
+          <w:szCs w:val="24"/>
+        </w:rPr>
+        <w:t xml:space="preserve"> </w:t>
+      </w:r>
+      <w:proofErr w:type="spellStart"/>
+      <w:r>
+        <w:rPr>
+          <w:rFonts w:ascii="Arial" w:hAnsi="Arial" w:cs="Arial"/>
+          <w:sz w:val="24"/>
+          <w:szCs w:val="24"/>
+        </w:rPr>
+        <w:t>first</w:t>
+      </w:r>
+      <w:proofErr w:type="spellEnd"/>
+      <w:r>
+        <w:rPr>
+          <w:rFonts w:ascii="Arial" w:hAnsi="Arial" w:cs="Arial"/>
+          <w:sz w:val="24"/>
+          <w:szCs w:val="24"/>
+        </w:rPr>
+        <w:t xml:space="preserve"> </w:t>
+      </w:r>
+      <w:proofErr w:type="spellStart"/>
+      <w:r>
+        <w:rPr>
+          <w:rFonts w:ascii="Arial" w:hAnsi="Arial" w:cs="Arial"/>
+          <w:sz w:val="24"/>
+          <w:szCs w:val="24"/>
+        </w:rPr>
+        <w:t>instance</w:t>
+      </w:r>
+      <w:proofErr w:type="spellEnd"/>
+      <w:r>
+        <w:rPr>
+          <w:rFonts w:ascii="Arial" w:hAnsi="Arial" w:cs="Arial"/>
+          <w:sz w:val="24"/>
+          <w:szCs w:val="24"/>
+        </w:rPr>
+        <w:t xml:space="preserve">, podríem pensar que podríem afegir una magnitud a la funció de pesos (magnituds: pes=temps, temps caminat, </w:t>
+      </w:r>
+      <w:proofErr w:type="spellStart"/>
+      <w:r>
+        <w:rPr>
+          <w:rFonts w:ascii="Arial" w:hAnsi="Arial" w:cs="Arial"/>
+          <w:sz w:val="24"/>
+          <w:szCs w:val="24"/>
+        </w:rPr>
+        <w:t>nombre_transbords</w:t>
+      </w:r>
+      <w:proofErr w:type="spellEnd"/>
+      <w:r>
+        <w:rPr>
+          <w:rFonts w:ascii="Arial" w:hAnsi="Arial" w:cs="Arial"/>
+          <w:sz w:val="24"/>
+          <w:szCs w:val="24"/>
+        </w:rPr>
+        <w:t>) que determinés la ”</w:t>
+      </w:r>
+      <w:proofErr w:type="spellStart"/>
+      <w:r>
+        <w:rPr>
+          <w:rFonts w:ascii="Arial" w:hAnsi="Arial" w:cs="Arial"/>
+          <w:sz w:val="24"/>
+          <w:szCs w:val="24"/>
+        </w:rPr>
+        <w:t>versemblança_del_camí_obtingut_amb_el_desitjat</w:t>
+      </w:r>
+      <w:proofErr w:type="spellEnd"/>
+      <w:r>
+        <w:rPr>
+          <w:rFonts w:ascii="Arial" w:hAnsi="Arial" w:cs="Arial"/>
+          <w:sz w:val="24"/>
+          <w:szCs w:val="24"/>
+        </w:rPr>
+        <w:t>”. És a dir, si jo poso que el destí final és tal entrada, i com passaria en aquest cas, això no és possible (comptant que no considerem els trams pel carrer) i donaríem una entrada de destí diferent, aquesta magnitud seria més gran que 0.</w:t>
+      </w:r>
+    </w:p>
+    <w:p>
+      <w:pPr>
+        <w:pStyle w:val="Prrafodelista"/>
+        <w:numPr>
+          <w:ilvl w:val="0"/>
+          <w:numId w:val="1"/>
+        </w:numPr>
+        <w:rPr>
+          <w:rFonts w:ascii="Arial" w:hAnsi="Arial" w:cs="Arial"/>
+          <w:sz w:val="24"/>
+          <w:szCs w:val="24"/>
+        </w:rPr>
+      </w:pPr>
+      <w:r>
+        <w:rPr>
+          <w:rFonts w:ascii="Arial" w:hAnsi="Arial" w:cs="Arial"/>
+          <w:sz w:val="24"/>
+          <w:szCs w:val="24"/>
+        </w:rPr>
+        <w:t>De totes maneres, això és útil depenent de com utilitzem aquesta funció.</w:t>
+      </w:r>
+    </w:p>
+    <w:p>
+      <w:pPr>
+        <w:pStyle w:val="Prrafodelista"/>
+        <w:numPr>
+          <w:ilvl w:val="1"/>
+          <w:numId w:val="1"/>
+        </w:numPr>
+        <w:rPr>
+          <w:rFonts w:ascii="Arial" w:hAnsi="Arial" w:cs="Arial"/>
+          <w:sz w:val="24"/>
+          <w:szCs w:val="24"/>
+        </w:rPr>
+      </w:pPr>
+      <w:r>
+        <w:rPr>
+          <w:rFonts w:ascii="Arial" w:hAnsi="Arial" w:cs="Arial"/>
+          <w:sz w:val="24"/>
+          <w:szCs w:val="24"/>
+        </w:rPr>
+        <w:t xml:space="preserve">Si la utilitzem per donar un camí òptim (abans que un altre de possible), no afectarà a res. Perquè fixat un trajecte que conté un origen o destí d’aquestes parades, </w:t>
+      </w:r>
+      <w:r>
+        <w:rPr>
+          <w:rFonts w:ascii="Arial" w:hAnsi="Arial" w:cs="Arial"/>
+          <w:sz w:val="24"/>
+          <w:szCs w:val="24"/>
+        </w:rPr>
+        <w:t xml:space="preserve">tots els camins tindran el mateix valor en aquesta magnitud. Llavors això no ens ajudaria a decantar-nos per un camí o un altre, que en principi és pel que serveix la funció aquesta. </w:t>
+      </w:r>
+    </w:p>
+    <w:p>
+      <w:pPr>
+        <w:pStyle w:val="Prrafodelista"/>
+        <w:numPr>
+          <w:ilvl w:val="1"/>
+          <w:numId w:val="1"/>
+        </w:numPr>
+        <w:rPr>
+          <w:rFonts w:ascii="Arial" w:hAnsi="Arial" w:cs="Arial"/>
+          <w:sz w:val="24"/>
+          <w:szCs w:val="24"/>
+        </w:rPr>
+      </w:pPr>
+      <w:r>
+        <w:rPr>
+          <w:rFonts w:ascii="Arial" w:hAnsi="Arial" w:cs="Arial"/>
+          <w:sz w:val="24"/>
+          <w:szCs w:val="24"/>
+        </w:rPr>
+        <w:sym w:font="Wingdings" w:char="F0E0"/>
+      </w:r>
+      <w:r>
+        <w:rPr>
+          <w:rFonts w:ascii="Arial" w:hAnsi="Arial" w:cs="Arial"/>
+          <w:sz w:val="24"/>
+          <w:szCs w:val="24"/>
+        </w:rPr>
+        <w:t xml:space="preserve"> Aquesta magnitud només seria útil si s’utilitzés entremig d’un camí, és on hi hauria diferència. Però aquest és l’únic cas d’aquest tipus en tot el metro de Barcelona, així que crec que no es pot aplicar.</w:t>
+      </w:r>
+    </w:p>
+    <w:p>
+      <w:pPr>
+        <w:pStyle w:val="Prrafodelista"/>
+        <w:numPr>
+          <w:ilvl w:val="1"/>
+          <w:numId w:val="1"/>
+        </w:numPr>
+        <w:rPr>
+          <w:rFonts w:ascii="Arial" w:hAnsi="Arial" w:cs="Arial"/>
+          <w:sz w:val="24"/>
+          <w:szCs w:val="24"/>
+        </w:rPr>
+      </w:pPr>
+      <w:r>
+        <w:rPr>
+          <w:rFonts w:ascii="Arial" w:hAnsi="Arial" w:cs="Arial"/>
+          <w:sz w:val="24"/>
+          <w:szCs w:val="24"/>
+        </w:rPr>
+        <w:t xml:space="preserve">Crec que com a molt aportaria </w:t>
+      </w:r>
+      <w:proofErr w:type="spellStart"/>
+      <w:r>
+        <w:rPr>
+          <w:rFonts w:ascii="Arial" w:hAnsi="Arial" w:cs="Arial"/>
+          <w:sz w:val="24"/>
+          <w:szCs w:val="24"/>
+        </w:rPr>
+        <w:t>algo</w:t>
+      </w:r>
+      <w:proofErr w:type="spellEnd"/>
+      <w:r>
+        <w:rPr>
+          <w:rFonts w:ascii="Arial" w:hAnsi="Arial" w:cs="Arial"/>
+          <w:sz w:val="24"/>
+          <w:szCs w:val="24"/>
+        </w:rPr>
+        <w:t xml:space="preserve"> en el cas que es donessin “puntuacions” a rutes, però no serveix per comparar res perquè no compararem rutes amb orígens i destins diferents.</w:t>
+      </w:r>
+    </w:p>
+    <w:p>
+      <w:pPr>
+        <w:pStyle w:val="Prrafodelista"/>
+        <w:numPr>
+          <w:ilvl w:val="0"/>
+          <w:numId w:val="1"/>
+        </w:numPr>
+        <w:rPr>
+          <w:rFonts w:ascii="Arial" w:hAnsi="Arial" w:cs="Arial"/>
+          <w:sz w:val="24"/>
+          <w:szCs w:val="24"/>
+        </w:rPr>
+      </w:pPr>
+      <w:r>
+        <w:rPr>
+          <w:rFonts w:ascii="Arial" w:hAnsi="Arial" w:cs="Arial"/>
+          <w:sz w:val="24"/>
+          <w:szCs w:val="24"/>
+        </w:rPr>
+        <w:lastRenderedPageBreak/>
+        <w:t xml:space="preserve">En conclusió: crec que l’únic en el que ens pot afectar és el cas del </w:t>
+      </w:r>
+      <w:proofErr w:type="spellStart"/>
+      <w:r>
+        <w:rPr>
+          <w:rFonts w:ascii="Arial" w:hAnsi="Arial" w:cs="Arial"/>
+          <w:sz w:val="24"/>
+          <w:szCs w:val="24"/>
+        </w:rPr>
+        <w:t>Dijkstra</w:t>
+      </w:r>
+      <w:proofErr w:type="spellEnd"/>
+      <w:r>
+        <w:rPr>
+          <w:rFonts w:ascii="Arial" w:hAnsi="Arial" w:cs="Arial"/>
+          <w:sz w:val="24"/>
+          <w:szCs w:val="24"/>
+        </w:rPr>
+        <w:t xml:space="preserve"> i </w:t>
+      </w:r>
+      <w:proofErr w:type="spellStart"/>
+      <w:r>
+        <w:rPr>
+          <w:rFonts w:ascii="Arial" w:hAnsi="Arial" w:cs="Arial"/>
+          <w:sz w:val="24"/>
+          <w:szCs w:val="24"/>
+        </w:rPr>
+        <w:t>l’A</w:t>
+      </w:r>
+      <w:proofErr w:type="spellEnd"/>
+      <w:r>
+        <w:rPr>
+          <w:rFonts w:ascii="Arial" w:hAnsi="Arial" w:cs="Arial"/>
+          <w:sz w:val="24"/>
+          <w:szCs w:val="24"/>
+        </w:rPr>
+        <w:t>* normals.</w:t>
       </w:r>
     </w:p>
     <w:sectPr>
@@ -432,7 +750,7 @@
         <w:rFonts w:ascii="Courier New" w:hAnsi="Courier New" w:cs="Courier New" w:hint="default"/>
       </w:rPr>
     </w:lvl>
-    <w:lvl w:ilvl="2" w:tplc="0C0A0005" w:tentative="1">
+    <w:lvl w:ilvl="2" w:tplc="0C0A0005">
       <w:start w:val="1"/>
       <w:numFmt w:val="bullet"/>
       <w:lvlText w:val=""/>

</xml_diff>